<commit_message>
Inicio: estructura base de las clases
</commit_message>
<xml_diff>
--- a/Semana 2/TAREA.docx
+++ b/Semana 2/TAREA.docx
@@ -2698,6 +2698,9 @@
         <w:jc w:val="both"/>
       </w:pPr>
       <w:r>
+        <w:rPr>
+          <w:noProof/>
+        </w:rPr>
         <w:lastRenderedPageBreak/>
         <w:drawing>
           <wp:inline distT="0" distB="0" distL="0" distR="0" wp14:anchorId="3B409E4A" wp14:editId="39053EAC">
@@ -2742,6 +2745,9 @@
         <w:jc w:val="both"/>
       </w:pPr>
       <w:r>
+        <w:rPr>
+          <w:noProof/>
+        </w:rPr>
         <w:drawing>
           <wp:inline distT="0" distB="0" distL="0" distR="0" wp14:anchorId="669ADCBE" wp14:editId="5E13503F">
             <wp:extent cx="3200677" cy="2842506"/>
@@ -3107,6 +3113,47 @@
       <w:pPr>
         <w:pStyle w:val="Prrafodelista"/>
         <w:jc w:val="both"/>
+        <w:rPr>
+          <w:b/>
+          <w:bCs/>
+        </w:rPr>
+      </w:pPr>
+      <w:r>
+        <w:rPr>
+          <w:b/>
+          <w:bCs/>
+        </w:rPr>
+        <w:t>ENLACE GIT HUB</w:t>
+      </w:r>
+    </w:p>
+    <w:p>
+      <w:pPr>
+        <w:pStyle w:val="Prrafodelista"/>
+        <w:jc w:val="both"/>
+        <w:rPr>
+          <w:b/>
+          <w:bCs/>
+        </w:rPr>
+      </w:pPr>
+      <w:hyperlink r:id="rId15" w:history="1">
+        <w:r>
+          <w:rPr>
+            <w:rStyle w:val="Hipervnculo"/>
+            <w:b/>
+            <w:bCs/>
+          </w:rPr>
+          <w:t>https://github.com/Fernanda7s/POO.git</w:t>
+        </w:r>
+      </w:hyperlink>
+    </w:p>
+    <w:p>
+      <w:pPr>
+        <w:pStyle w:val="Prrafodelista"/>
+        <w:jc w:val="both"/>
+        <w:rPr>
+          <w:b/>
+          <w:bCs/>
+        </w:rPr>
       </w:pPr>
     </w:p>
     <w:p>
@@ -3117,7 +3164,7 @@
       </w:pPr>
     </w:p>
     <w:sectPr>
-      <w:headerReference w:type="default" r:id="rId15"/>
+      <w:headerReference w:type="default" r:id="rId16"/>
       <w:pgSz w:w="12240" w:h="15840"/>
       <w:pgMar w:top="1440" w:right="1440" w:bottom="1440" w:left="1440" w:header="708" w:footer="708" w:gutter="0"/>
       <w:cols w:space="708"/>
@@ -3423,7 +3470,7 @@
                       </a:ln>
                       <a:extLst>
                         <a:ext uri="{909E8E84-426E-40dd-AFC4-6F175D3DCCD1}">
-                          <a14:hiddenFill xmlns:arto="http://schemas.microsoft.com/office/word/2006/arto" xmlns="" xmlns:mo="http://schemas.microsoft.com/office/mac/office/2008/main" xmlns:mv="urn:schemas-microsoft-com:mac:vml" xmlns:o="urn:schemas-microsoft-com:office:office" xmlns:v="urn:schemas-microsoft-com:vml" xmlns:w10="urn:schemas-microsoft-com:office:word" xmlns:w="http://schemas.openxmlformats.org/wordprocessingml/2006/main" xmlns:a14="http://schemas.microsoft.com/office/drawing/2010/main" xmlns:pic="http://schemas.openxmlformats.org/drawingml/2006/picture">
+                          <a14:hiddenFill xmlns:pic="http://schemas.openxmlformats.org/drawingml/2006/picture" xmlns:a14="http://schemas.microsoft.com/office/drawing/2010/main" xmlns:w="http://schemas.openxmlformats.org/wordprocessingml/2006/main" xmlns:w10="urn:schemas-microsoft-com:office:word" xmlns:v="urn:schemas-microsoft-com:vml" xmlns:o="urn:schemas-microsoft-com:office:office" xmlns:mv="urn:schemas-microsoft-com:mac:vml" xmlns:mo="http://schemas.microsoft.com/office/mac/office/2008/main" xmlns="" xmlns:arto="http://schemas.microsoft.com/office/word/2006/arto">
                             <a:noFill/>
                           </a14:hiddenFill>
                         </a:ext>
@@ -11233,6 +11280,29 @@
     <w:uiPriority w:val="99"/>
     <w:rsid w:val="00EB459A"/>
   </w:style>
+  <w:style w:type="character" w:styleId="Hipervnculo">
+    <w:name w:val="Hyperlink"/>
+    <w:basedOn w:val="Fuentedeprrafopredeter"/>
+    <w:uiPriority w:val="99"/>
+    <w:unhideWhenUsed/>
+    <w:rsid w:val="0059281F"/>
+    <w:rPr>
+      <w:color w:val="467886" w:themeColor="hyperlink"/>
+      <w:u w:val="single"/>
+    </w:rPr>
+  </w:style>
+  <w:style w:type="character" w:styleId="Mencinsinresolver">
+    <w:name w:val="Unresolved Mention"/>
+    <w:basedOn w:val="Fuentedeprrafopredeter"/>
+    <w:uiPriority w:val="99"/>
+    <w:semiHidden/>
+    <w:unhideWhenUsed/>
+    <w:rsid w:val="0059281F"/>
+    <w:rPr>
+      <w:color w:val="605E5C"/>
+      <w:shd w:val="clear" w:color="auto" w:fill="E1DFDD"/>
+    </w:rPr>
+  </w:style>
 </w:styles>
 </file>
 

</xml_diff>